<commit_message>
Add retraction/correction banners to superseded reports pointing to corrected analysis
</commit_message>
<xml_diff>
--- a/complete_analysis.docx
+++ b/complete_analysis.docx
@@ -2,63 +2,129 @@
 <file path=word/document.xml><?xml version="1.0" encoding="utf-8"?>
 <w:document xmlns:w="http://schemas.openxmlformats.org/wordprocessingml/2006/main" xmlns:m="http://schemas.openxmlformats.org/officeDocument/2006/math" xmlns:r="http://schemas.openxmlformats.org/officeDocument/2006/relationships" xmlns:o="urn:schemas-microsoft-com:office:office" xmlns:v="urn:schemas-microsoft-com:vml" xmlns:w10="urn:schemas-microsoft-com:office:word" xmlns:a="http://schemas.openxmlformats.org/drawingml/2006/main" xmlns:pic="http://schemas.openxmlformats.org/drawingml/2006/picture" xmlns:wp="http://schemas.openxmlformats.org/drawingml/2006/wordprocessingDrawing">
   <w:body>
-    <w:bookmarkStart w:id="23" w:name="Xc0229abfc12a5bdc769c2154d3afb97dcd64fff"/>
-    <w:p>
-      <w:pPr>
-        <w:pStyle w:val="Heading1"/>
-      </w:pPr>
-      <w:r>
-        <w:t xml:space="preserve">NASA Spacecraft Re-Entry Transcript: Complete Analysis</w:t>
-      </w:r>
-    </w:p>
-    <w:p>
-      <w:pPr>
-        <w:pStyle w:val="FirstParagraph"/>
-      </w:pPr>
-      <w:r>
-        <w:rPr>
-          <w:bCs/>
-          <w:b/>
-        </w:rPr>
-        <w:t xml:space="preserve">Research by:</w:t>
-      </w:r>
-      <w:r>
-        <w:t xml:space="preserve"> </w:t>
-      </w:r>
-      <w:r>
-        <w:t xml:space="preserve">TrueSiddiqui</w:t>
-      </w:r>
-      <w:r>
-        <w:br/>
-      </w:r>
-      <w:r>
-        <w:rPr>
-          <w:bCs/>
-          <w:b/>
-        </w:rPr>
-        <w:t xml:space="preserve">Date:</w:t>
-      </w:r>
-      <w:r>
-        <w:t xml:space="preserve"> </w:t>
-      </w:r>
-      <w:r>
-        <w:t xml:space="preserve">August 23, 2026</w:t>
-      </w:r>
-      <w:r>
-        <w:br/>
-      </w:r>
-      <w:r>
-        <w:rPr>
-          <w:bCs/>
-          <w:b/>
-        </w:rPr>
-        <w:t xml:space="preserve">Repository:</w:t>
-      </w:r>
-      <w:r>
-        <w:t xml:space="preserve"> </w:t>
-      </w:r>
-      <w:r>
-        <w:t xml:space="preserve">https://github.com/TrueSiddiqui/NASA-Caught</w:t>
+    <w:p>
+      <w:pPr>
+        <w:pStyle w:val="BlockText"/>
+      </w:pPr>
+      <w:r>
+        <w:rPr>
+          <w:bCs/>
+          <w:b/>
+        </w:rPr>
+        <w:t xml:space="preserve">Note on telemetry/velocity/distance claims:</w:t>
+      </w:r>
+      <w:r>
+        <w:t xml:space="preserve"> </w:t>
+      </w:r>
+      <w:r>
+        <w:t xml:space="preserve">Any statements in this document about on-screen</w:t>
+      </w:r>
+      <w:r>
+        <w:t xml:space="preserve"> </w:t>
+      </w:r>
+      <w:r>
+        <w:rPr>
+          <w:bCs/>
+          <w:b/>
+        </w:rPr>
+        <w:t xml:space="preserve">velocity, distance, or timestamp</w:t>
+      </w:r>
+      <w:r>
+        <w:t xml:space="preserve"> </w:t>
+      </w:r>
+      <w:r>
+        <w:t xml:space="preserve">behavior should be read together with the corrected</w:t>
+      </w:r>
+      <w:r>
+        <w:t xml:space="preserve"> </w:t>
+      </w:r>
+      <w:hyperlink r:id="rId20">
+        <w:r>
+          <w:rPr>
+            <w:rStyle w:val="VerbatimChar"/>
+          </w:rPr>
+          <w:t xml:space="preserve">comprehensive_frame_report.md</w:t>
+        </w:r>
+      </w:hyperlink>
+      <w:r>
+        <w:t xml:space="preserve">. Re-verification of the dial readings found that the earlier</w:t>
+      </w:r>
+      <w:r>
+        <w:t xml:space="preserve"> </w:t>
+      </w:r>
+      <w:r>
+        <w:t xml:space="preserve">“</w:t>
+      </w:r>
+      <w:r>
+        <w:t xml:space="preserve">time reset</w:t>
+      </w:r>
+      <w:r>
+        <w:t xml:space="preserve">”</w:t>
+      </w:r>
+      <w:r>
+        <w:t xml:space="preserve">,</w:t>
+      </w:r>
+      <w:r>
+        <w:t xml:space="preserve"> </w:t>
+      </w:r>
+      <w:r>
+        <w:t xml:space="preserve">“</w:t>
+      </w:r>
+      <w:r>
+        <w:t xml:space="preserve">velocity reversal</w:t>
+      </w:r>
+      <w:r>
+        <w:t xml:space="preserve">”</w:t>
+      </w:r>
+      <w:r>
+        <w:t xml:space="preserve">, and</w:t>
+      </w:r>
+      <w:r>
+        <w:t xml:space="preserve"> </w:t>
+      </w:r>
+      <w:r>
+        <w:t xml:space="preserve">“</w:t>
+      </w:r>
+      <w:r>
+        <w:t xml:space="preserve">geometric impossibility</w:t>
+      </w:r>
+      <w:r>
+        <w:t xml:space="preserve">”</w:t>
+      </w:r>
+      <w:r>
+        <w:t xml:space="preserve"> </w:t>
+      </w:r>
+      <w:r>
+        <w:t xml:space="preserve">claims were</w:t>
+      </w:r>
+      <w:r>
+        <w:t xml:space="preserve"> </w:t>
+      </w:r>
+      <w:r>
+        <w:rPr>
+          <w:bCs/>
+          <w:b/>
+        </w:rPr>
+        <w:t xml:space="preserve">OCR misreads / a misread CURRENT-vs-TOTAL time field and have been retracted</w:t>
+      </w:r>
+      <w:r>
+        <w:t xml:space="preserve">. This segment is also a NASA-labeled</w:t>
+      </w:r>
+      <w:r>
+        <w:t xml:space="preserve"> </w:t>
+      </w:r>
+      <w:r>
+        <w:rPr>
+          <w:bCs/>
+          <w:b/>
+        </w:rPr>
+        <w:t xml:space="preserve">VISUALIZATION shown during the comms blackout</w:t>
+      </w:r>
+      <w:r>
+        <w:t xml:space="preserve"> </w:t>
+      </w:r>
+      <w:r>
+        <w:t xml:space="preserve">(modeled values, not a live downlink). Treat the corrected report as authoritative for telemetry.</w:t>
       </w:r>
     </w:p>
     <w:p>
@@ -68,7 +134,73 @@
         </w:pict>
       </w:r>
     </w:p>
-    <w:bookmarkStart w:id="21" w:name="source-reference"/>
+    <w:bookmarkStart w:id="24" w:name="Xc0229abfc12a5bdc769c2154d3afb97dcd64fff"/>
+    <w:p>
+      <w:pPr>
+        <w:pStyle w:val="Heading1"/>
+      </w:pPr>
+      <w:r>
+        <w:t xml:space="preserve">NASA Spacecraft Re-Entry Transcript: Complete Analysis</w:t>
+      </w:r>
+    </w:p>
+    <w:p>
+      <w:pPr>
+        <w:pStyle w:val="FirstParagraph"/>
+      </w:pPr>
+      <w:r>
+        <w:rPr>
+          <w:bCs/>
+          <w:b/>
+        </w:rPr>
+        <w:t xml:space="preserve">Research by:</w:t>
+      </w:r>
+      <w:r>
+        <w:t xml:space="preserve"> </w:t>
+      </w:r>
+      <w:r>
+        <w:t xml:space="preserve">TrueSiddiqui</w:t>
+      </w:r>
+      <w:r>
+        <w:br/>
+      </w:r>
+      <w:r>
+        <w:rPr>
+          <w:bCs/>
+          <w:b/>
+        </w:rPr>
+        <w:t xml:space="preserve">Date:</w:t>
+      </w:r>
+      <w:r>
+        <w:t xml:space="preserve"> </w:t>
+      </w:r>
+      <w:r>
+        <w:t xml:space="preserve">August 23, 2026</w:t>
+      </w:r>
+      <w:r>
+        <w:br/>
+      </w:r>
+      <w:r>
+        <w:rPr>
+          <w:bCs/>
+          <w:b/>
+        </w:rPr>
+        <w:t xml:space="preserve">Repository:</w:t>
+      </w:r>
+      <w:r>
+        <w:t xml:space="preserve"> </w:t>
+      </w:r>
+      <w:r>
+        <w:t xml:space="preserve">https://github.com/TrueSiddiqui/NASA-Caught</w:t>
+      </w:r>
+    </w:p>
+    <w:p>
+      <w:r>
+        <w:pict>
+          <v:rect style="width:0;height:1.5pt" o:hralign="center" o:hrstd="t" o:hr="t"/>
+        </w:pict>
+      </w:r>
+    </w:p>
+    <w:bookmarkStart w:id="22" w:name="source-reference"/>
     <w:p>
       <w:pPr>
         <w:pStyle w:val="Heading2"/>
@@ -97,7 +229,7 @@
       <w:r>
         <w:t xml:space="preserve"> </w:t>
       </w:r>
-      <w:hyperlink r:id="rId20">
+      <w:hyperlink r:id="rId21">
         <w:r>
           <w:rPr>
             <w:rStyle w:val="Hyperlink"/>
@@ -121,8 +253,8 @@
         </w:pict>
       </w:r>
     </w:p>
-    <w:bookmarkEnd w:id="21"/>
-    <w:bookmarkStart w:id="22" w:name="table-of-contents"/>
+    <w:bookmarkEnd w:id="22"/>
+    <w:bookmarkStart w:id="23" w:name="table-of-contents"/>
     <w:p>
       <w:pPr>
         <w:pStyle w:val="Heading2"/>
@@ -240,9 +372,9 @@
         </w:pict>
       </w:r>
     </w:p>
-    <w:bookmarkEnd w:id="22"/>
     <w:bookmarkEnd w:id="23"/>
-    <w:bookmarkStart w:id="25" w:name="original-transcript"/>
+    <w:bookmarkEnd w:id="24"/>
+    <w:bookmarkStart w:id="26" w:name="original-transcript"/>
     <w:p>
       <w:pPr>
         <w:pStyle w:val="Heading1"/>
@@ -358,7 +490,7 @@
         </w:pict>
       </w:r>
     </w:p>
-    <w:bookmarkStart w:id="24" w:name="transcript-text"/>
+    <w:bookmarkStart w:id="25" w:name="transcript-text"/>
     <w:p>
       <w:pPr>
         <w:pStyle w:val="Heading2"/>
@@ -2174,9 +2306,9 @@
         </w:pict>
       </w:r>
     </w:p>
-    <w:bookmarkEnd w:id="24"/>
     <w:bookmarkEnd w:id="25"/>
-    <w:bookmarkStart w:id="56" w:name="initial-analysis---first-pass"/>
+    <w:bookmarkEnd w:id="26"/>
+    <w:bookmarkStart w:id="57" w:name="initial-analysis---first-pass"/>
     <w:p>
       <w:pPr>
         <w:pStyle w:val="Heading1"/>
@@ -2203,7 +2335,7 @@
         <w:t xml:space="preserve">Identify all issues without bias — examining technical accuracy, logical consistency, and procedural adherence.</w:t>
       </w:r>
     </w:p>
-    <w:bookmarkStart w:id="35" w:name="critical-issues-found"/>
+    <w:bookmarkStart w:id="36" w:name="critical-issues-found"/>
     <w:p>
       <w:pPr>
         <w:pStyle w:val="Heading2"/>
@@ -2212,7 +2344,7 @@
         <w:t xml:space="preserve">Critical Issues Found</w:t>
       </w:r>
     </w:p>
-    <w:bookmarkStart w:id="26" w:name="data-processing-during-blackout-13135"/>
+    <w:bookmarkStart w:id="27" w:name="data-processing-during-blackout-13135"/>
     <w:p>
       <w:pPr>
         <w:pStyle w:val="Heading3"/>
@@ -2321,8 +2453,8 @@
         <w:t xml:space="preserve">The plasma envelope that blocks voice should also block data telemetry</w:t>
       </w:r>
     </w:p>
-    <w:bookmarkEnd w:id="26"/>
-    <w:bookmarkStart w:id="27" w:name="X7341bcc9b09fe35066eaeee2887f460e62eb624"/>
+    <w:bookmarkEnd w:id="27"/>
+    <w:bookmarkStart w:id="28" w:name="X7341bcc9b09fe35066eaeee2887f460e62eb624"/>
     <w:p>
       <w:pPr>
         <w:pStyle w:val="Heading3"/>
@@ -2421,8 +2553,8 @@
         <w:t xml:space="preserve">without receiving spacecraft data?</w:t>
       </w:r>
     </w:p>
-    <w:bookmarkEnd w:id="27"/>
-    <w:bookmarkStart w:id="28" w:name="X4c5aa39c0f6e7f08b415ebc462524157a2ebfa5"/>
+    <w:bookmarkEnd w:id="28"/>
+    <w:bookmarkStart w:id="29" w:name="X4c5aa39c0f6e7f08b415ebc462524157a2ebfa5"/>
     <w:p>
       <w:pPr>
         <w:pStyle w:val="Heading3"/>
@@ -2573,8 +2705,8 @@
         <w:t xml:space="preserve">”</w:t>
       </w:r>
     </w:p>
-    <w:bookmarkEnd w:id="28"/>
-    <w:bookmarkStart w:id="29" w:name="unexplained-camera-failures"/>
+    <w:bookmarkEnd w:id="29"/>
+    <w:bookmarkStart w:id="30" w:name="unexplained-camera-failures"/>
     <w:p>
       <w:pPr>
         <w:pStyle w:val="Heading3"/>
@@ -2675,8 +2807,8 @@
         <w:t xml:space="preserve">Why are internal cameras failing post-blackout?</w:t>
       </w:r>
     </w:p>
-    <w:bookmarkEnd w:id="29"/>
-    <w:bookmarkStart w:id="30" w:name="gps-data-claim-13431"/>
+    <w:bookmarkEnd w:id="30"/>
+    <w:bookmarkStart w:id="31" w:name="gps-data-claim-13431"/>
     <w:p>
       <w:pPr>
         <w:pStyle w:val="Heading3"/>
@@ -2755,8 +2887,8 @@
         <w:t xml:space="preserve">only ~1.5 minutes after blackout exit seems optimistic</w:t>
       </w:r>
     </w:p>
-    <w:bookmarkEnd w:id="30"/>
-    <w:bookmarkStart w:id="31" w:name="entry-speed-analysis"/>
+    <w:bookmarkEnd w:id="31"/>
+    <w:bookmarkStart w:id="32" w:name="entry-speed-analysis"/>
     <w:p>
       <w:pPr>
         <w:pStyle w:val="Heading3"/>
@@ -2821,8 +2953,8 @@
         <w:t xml:space="preserve">This is a factual reading from the transcript; comparative analysis would require external reference data</w:t>
       </w:r>
     </w:p>
-    <w:bookmarkEnd w:id="31"/>
-    <w:bookmarkStart w:id="32" w:name="splashdown-time-prediction-error"/>
+    <w:bookmarkEnd w:id="32"/>
+    <w:bookmarkStart w:id="33" w:name="splashdown-time-prediction-error"/>
     <w:p>
       <w:pPr>
         <w:pStyle w:val="Heading3"/>
@@ -2921,8 +3053,8 @@
         <w:t xml:space="preserve">For a mission with precision guidance and GPS, being 36 seconds off is notable</w:t>
       </w:r>
     </w:p>
-    <w:bookmarkEnd w:id="32"/>
-    <w:bookmarkStart w:id="33" w:name="missing-drogue-deployment-altitude"/>
+    <w:bookmarkEnd w:id="33"/>
+    <w:bookmarkStart w:id="34" w:name="missing-drogue-deployment-altitude"/>
     <w:p>
       <w:pPr>
         <w:pStyle w:val="Heading3"/>
@@ -2975,8 +3107,8 @@
         <w:t xml:space="preserve">Impossible to verify correct deployment without altitude callout</w:t>
       </w:r>
     </w:p>
-    <w:bookmarkEnd w:id="33"/>
-    <w:bookmarkStart w:id="34" w:name="blackout-duration-discrepancy"/>
+    <w:bookmarkEnd w:id="34"/>
+    <w:bookmarkStart w:id="35" w:name="blackout-duration-discrepancy"/>
     <w:p>
       <w:pPr>
         <w:pStyle w:val="Heading3"/>
@@ -3045,9 +3177,9 @@
         <w:t xml:space="preserve">+46 seconds = +13% longer than predicted</w:t>
       </w:r>
     </w:p>
-    <w:bookmarkEnd w:id="34"/>
     <w:bookmarkEnd w:id="35"/>
-    <w:bookmarkStart w:id="41" w:name="procedural-protocol-issues"/>
+    <w:bookmarkEnd w:id="36"/>
+    <w:bookmarkStart w:id="42" w:name="procedural-protocol-issues"/>
     <w:p>
       <w:pPr>
         <w:pStyle w:val="Heading2"/>
@@ -3056,7 +3188,7 @@
         <w:t xml:space="preserve">Procedural &amp; Protocol Issues</w:t>
       </w:r>
     </w:p>
-    <w:bookmarkStart w:id="36" w:name="no-flight-director-polling"/>
+    <w:bookmarkStart w:id="37" w:name="no-flight-director-polling"/>
     <w:p>
       <w:pPr>
         <w:pStyle w:val="Heading3"/>
@@ -3149,8 +3281,8 @@
         <w:t xml:space="preserve">This is standard NASA protocol for critical mission phases</w:t>
       </w:r>
     </w:p>
-    <w:bookmarkEnd w:id="36"/>
-    <w:bookmarkStart w:id="37" w:name="mixed-communication-channels"/>
+    <w:bookmarkEnd w:id="37"/>
+    <w:bookmarkStart w:id="38" w:name="mixed-communication-channels"/>
     <w:p>
       <w:pPr>
         <w:pStyle w:val="Heading3"/>
@@ -3213,8 +3345,8 @@
         <w:t xml:space="preserve">Real missions separate these on different audio loops</w:t>
       </w:r>
     </w:p>
-    <w:bookmarkEnd w:id="37"/>
-    <w:bookmarkStart w:id="38" w:name="no-g-force-readings"/>
+    <w:bookmarkEnd w:id="38"/>
+    <w:bookmarkStart w:id="39" w:name="no-g-force-readings"/>
     <w:p>
       <w:pPr>
         <w:pStyle w:val="Heading3"/>
@@ -3269,8 +3401,8 @@
         <w:t xml:space="preserve">No crew physical status checks</w:t>
       </w:r>
     </w:p>
-    <w:bookmarkEnd w:id="38"/>
-    <w:bookmarkStart w:id="39" w:name="no-roll-or-bank-angle-callouts"/>
+    <w:bookmarkEnd w:id="39"/>
+    <w:bookmarkStart w:id="40" w:name="no-roll-or-bank-angle-callouts"/>
     <w:p>
       <w:pPr>
         <w:pStyle w:val="Heading3"/>
@@ -3303,8 +3435,8 @@
         <w:t xml:space="preserve">No mention of roll angles or guidance mode callouts</w:t>
       </w:r>
     </w:p>
-    <w:bookmarkEnd w:id="39"/>
-    <w:bookmarkStart w:id="40" w:name="missing-peak-heating-confirmation"/>
+    <w:bookmarkEnd w:id="40"/>
+    <w:bookmarkStart w:id="41" w:name="missing-peak-heating-confirmation"/>
     <w:p>
       <w:pPr>
         <w:pStyle w:val="Heading3"/>
@@ -3365,9 +3497,9 @@
         <w:t xml:space="preserve">No confirmation peak heating occurred or was survived</w:t>
       </w:r>
     </w:p>
-    <w:bookmarkEnd w:id="40"/>
     <w:bookmarkEnd w:id="41"/>
-    <w:bookmarkStart w:id="45" w:name="technical-anomalies"/>
+    <w:bookmarkEnd w:id="42"/>
+    <w:bookmarkStart w:id="46" w:name="technical-anomalies"/>
     <w:p>
       <w:pPr>
         <w:pStyle w:val="Heading2"/>
@@ -3376,7 +3508,7 @@
         <w:t xml:space="preserve">Technical Anomalies</w:t>
       </w:r>
     </w:p>
-    <w:bookmarkStart w:id="42" w:name="hydrazinecabin-pressure-logic-error"/>
+    <w:bookmarkStart w:id="43" w:name="hydrazinecabin-pressure-logic-error"/>
     <w:p>
       <w:pPr>
         <w:pStyle w:val="Heading3"/>
@@ -3447,8 +3579,8 @@
         <w:t xml:space="preserve">These are unrelated systems</w:t>
       </w:r>
     </w:p>
-    <w:bookmarkEnd w:id="42"/>
-    <w:bookmarkStart w:id="43" w:name="total-distance-anomaly"/>
+    <w:bookmarkEnd w:id="43"/>
+    <w:bookmarkStart w:id="44" w:name="total-distance-anomaly"/>
     <w:p>
       <w:pPr>
         <w:pStyle w:val="Heading3"/>
@@ -3513,8 +3645,8 @@
         <w:t xml:space="preserve">Cannot verify without reference trajectory data</w:t>
       </w:r>
     </w:p>
-    <w:bookmarkEnd w:id="43"/>
-    <w:bookmarkStart w:id="44" w:name="forward-bay-cover-sequence"/>
+    <w:bookmarkEnd w:id="44"/>
+    <w:bookmarkStart w:id="45" w:name="forward-bay-cover-sequence"/>
     <w:p>
       <w:pPr>
         <w:pStyle w:val="Heading3"/>
@@ -3595,9 +3727,9 @@
         <w:t xml:space="preserve">Actual forward bay cover jettison callout</w:t>
       </w:r>
     </w:p>
-    <w:bookmarkEnd w:id="44"/>
     <w:bookmarkEnd w:id="45"/>
-    <w:bookmarkStart w:id="50" w:name="missing-standard-callouts"/>
+    <w:bookmarkEnd w:id="46"/>
+    <w:bookmarkStart w:id="51" w:name="missing-standard-callouts"/>
     <w:p>
       <w:pPr>
         <w:pStyle w:val="Heading2"/>
@@ -3606,7 +3738,7 @@
         <w:t xml:space="preserve">Missing Standard Callouts</w:t>
       </w:r>
     </w:p>
-    <w:bookmarkStart w:id="46" w:name="no-mark-calls"/>
+    <w:bookmarkStart w:id="47" w:name="no-mark-calls"/>
     <w:p>
       <w:pPr>
         <w:pStyle w:val="Heading3"/>
@@ -3721,8 +3853,8 @@
         <w:t xml:space="preserve">calls in entire transcript</w:t>
       </w:r>
     </w:p>
-    <w:bookmarkEnd w:id="46"/>
-    <w:bookmarkStart w:id="47" w:name="no-systems-status"/>
+    <w:bookmarkEnd w:id="47"/>
+    <w:bookmarkStart w:id="48" w:name="no-systems-status"/>
     <w:p>
       <w:pPr>
         <w:pStyle w:val="Heading3"/>
@@ -3773,8 +3905,8 @@
         <w:t xml:space="preserve">confirmations</w:t>
       </w:r>
     </w:p>
-    <w:bookmarkEnd w:id="47"/>
-    <w:bookmarkStart w:id="48" w:name="no-range-safety-mentions"/>
+    <w:bookmarkEnd w:id="48"/>
+    <w:bookmarkStart w:id="49" w:name="no-range-safety-mentions"/>
     <w:p>
       <w:pPr>
         <w:pStyle w:val="Heading3"/>
@@ -3825,8 +3957,8 @@
         <w:t xml:space="preserve">calls</w:t>
       </w:r>
     </w:p>
-    <w:bookmarkEnd w:id="48"/>
-    <w:bookmarkStart w:id="49" w:name="no-crew-status-checks"/>
+    <w:bookmarkEnd w:id="49"/>
+    <w:bookmarkStart w:id="50" w:name="no-crew-status-checks"/>
     <w:p>
       <w:pPr>
         <w:pStyle w:val="Heading3"/>
@@ -3889,9 +4021,9 @@
         <w:t xml:space="preserve">No confirmation crew is secured for splashdown impact</w:t>
       </w:r>
     </w:p>
-    <w:bookmarkEnd w:id="49"/>
     <w:bookmarkEnd w:id="50"/>
-    <w:bookmarkStart w:id="54" w:name="suspicious-details"/>
+    <w:bookmarkEnd w:id="51"/>
+    <w:bookmarkStart w:id="55" w:name="suspicious-details"/>
     <w:p>
       <w:pPr>
         <w:pStyle w:val="Heading2"/>
@@ -3900,7 +4032,7 @@
         <w:t xml:space="preserve">Suspicious Details</w:t>
       </w:r>
     </w:p>
-    <w:bookmarkStart w:id="51" w:name="launch-date-april-1st"/>
+    <w:bookmarkStart w:id="52" w:name="launch-date-april-1st"/>
     <w:p>
       <w:pPr>
         <w:pStyle w:val="Heading3"/>
@@ -3933,8 +4065,8 @@
         <w:t xml:space="preserve">No NASA lunar mission has launched on April 1st (to date)</w:t>
       </w:r>
     </w:p>
-    <w:bookmarkEnd w:id="51"/>
-    <w:bookmarkStart w:id="52" w:name="no-mission-designation"/>
+    <w:bookmarkEnd w:id="52"/>
+    <w:bookmarkStart w:id="53" w:name="no-mission-designation"/>
     <w:p>
       <w:pPr>
         <w:pStyle w:val="Heading3"/>
@@ -4021,8 +4153,8 @@
         <w:t xml:space="preserve">or any designation</w:t>
       </w:r>
     </w:p>
-    <w:bookmarkEnd w:id="52"/>
-    <w:bookmarkStart w:id="53" w:name="commander-reid-wiseman"/>
+    <w:bookmarkEnd w:id="53"/>
+    <w:bookmarkStart w:id="54" w:name="commander-reid-wiseman"/>
     <w:p>
       <w:pPr>
         <w:pStyle w:val="Heading3"/>
@@ -4071,9 +4203,9 @@
         <w:t xml:space="preserve">But Artemis II hasn’t launched yet (as of early 2026)</w:t>
       </w:r>
     </w:p>
-    <w:bookmarkEnd w:id="53"/>
     <w:bookmarkEnd w:id="54"/>
-    <w:bookmarkStart w:id="55" w:name="summary-initial-pass"/>
+    <w:bookmarkEnd w:id="55"/>
+    <w:bookmarkStart w:id="56" w:name="summary-initial-pass"/>
     <w:p>
       <w:pPr>
         <w:pStyle w:val="Heading2"/>
@@ -4167,9 +4299,9 @@
         </w:pict>
       </w:r>
     </w:p>
-    <w:bookmarkEnd w:id="55"/>
     <w:bookmarkEnd w:id="56"/>
-    <w:bookmarkStart w:id="101" w:name="deep-analysis---second-pass"/>
+    <w:bookmarkEnd w:id="57"/>
+    <w:bookmarkStart w:id="102" w:name="deep-analysis---second-pass"/>
     <w:p>
       <w:pPr>
         <w:pStyle w:val="Heading1"/>
@@ -4196,7 +4328,7 @@
         <w:t xml:space="preserve">Examine every line with extreme scrutiny for additional physics, trajectory, communication, and parachute sequence issues.</w:t>
       </w:r>
     </w:p>
-    <w:bookmarkStart w:id="60" w:name="additional-physics-trajectory-issues"/>
+    <w:bookmarkStart w:id="61" w:name="additional-physics-trajectory-issues"/>
     <w:p>
       <w:pPr>
         <w:pStyle w:val="Heading2"/>
@@ -4205,7 +4337,7 @@
         <w:t xml:space="preserve">Additional Physics &amp; Trajectory Issues</w:t>
       </w:r>
     </w:p>
-    <w:bookmarkStart w:id="57" w:name="impossible-deceleration-profile"/>
+    <w:bookmarkStart w:id="58" w:name="impossible-deceleration-profile"/>
     <w:p>
       <w:pPr>
         <w:pStyle w:val="Heading3"/>
@@ -4314,8 +4446,8 @@
         <w:t xml:space="preserve">Deceleration from high speed to lower speed in this distance requires analysis</w:t>
       </w:r>
     </w:p>
-    <w:bookmarkEnd w:id="57"/>
-    <w:bookmarkStart w:id="58" w:name="heat-shield-temperature-inconsistency"/>
+    <w:bookmarkEnd w:id="58"/>
+    <w:bookmarkStart w:id="59" w:name="heat-shield-temperature-inconsistency"/>
     <w:p>
       <w:pPr>
         <w:pStyle w:val="Heading3"/>
@@ -4380,8 +4512,8 @@
         <w:t xml:space="preserve">1,000°F uncertainty seems large for a predicted value</w:t>
       </w:r>
     </w:p>
-    <w:bookmarkEnd w:id="58"/>
-    <w:bookmarkStart w:id="59" w:name="splashdown-countdown-drift"/>
+    <w:bookmarkEnd w:id="59"/>
+    <w:bookmarkStart w:id="60" w:name="splashdown-countdown-drift"/>
     <w:p>
       <w:pPr>
         <w:pStyle w:val="Heading3"/>
@@ -4646,9 +4778,9 @@
         <w:t xml:space="preserve">between 27-39 seconds early</w:t>
       </w:r>
     </w:p>
-    <w:bookmarkEnd w:id="59"/>
     <w:bookmarkEnd w:id="60"/>
-    <w:bookmarkStart w:id="66" w:name="Xd8d99376d0c56400cf9d9e9c277fee9b28073c9"/>
+    <w:bookmarkEnd w:id="61"/>
+    <w:bookmarkStart w:id="67" w:name="Xd8d99376d0c56400cf9d9e9c277fee9b28073c9"/>
     <w:p>
       <w:pPr>
         <w:pStyle w:val="Heading2"/>
@@ -4657,7 +4789,7 @@
         <w:t xml:space="preserve">Additional Communication Protocol Violations</w:t>
       </w:r>
     </w:p>
-    <w:bookmarkStart w:id="61" w:name="no-callsign-discipline"/>
+    <w:bookmarkStart w:id="62" w:name="no-callsign-discipline"/>
     <w:p>
       <w:pPr>
         <w:pStyle w:val="Heading3"/>
@@ -4808,8 +4940,8 @@
         <w:t xml:space="preserve">protocol</w:t>
       </w:r>
     </w:p>
-    <w:bookmarkEnd w:id="61"/>
-    <w:bookmarkStart w:id="62" w:name="generic-recovery-teams-reference"/>
+    <w:bookmarkEnd w:id="62"/>
+    <w:bookmarkStart w:id="63" w:name="generic-recovery-teams-reference"/>
     <w:p>
       <w:pPr>
         <w:pStyle w:val="Heading3"/>
@@ -4898,8 +5030,8 @@
         <w:t xml:space="preserve">Real missions: specific asset callsigns</w:t>
       </w:r>
     </w:p>
-    <w:bookmarkEnd w:id="62"/>
-    <w:bookmarkStart w:id="63" w:name="no-weather-report"/>
+    <w:bookmarkEnd w:id="63"/>
+    <w:bookmarkStart w:id="64" w:name="no-weather-report"/>
     <w:p>
       <w:pPr>
         <w:pStyle w:val="Heading3"/>
@@ -4952,8 +5084,8 @@
         <w:t xml:space="preserve">of weather conditions</w:t>
       </w:r>
     </w:p>
-    <w:bookmarkEnd w:id="63"/>
-    <w:bookmarkStart w:id="64" w:name="no-backup-landing-zone-discussion"/>
+    <w:bookmarkEnd w:id="64"/>
+    <w:bookmarkStart w:id="65" w:name="no-backup-landing-zone-discussion"/>
     <w:p>
       <w:pPr>
         <w:pStyle w:val="Heading3"/>
@@ -4990,8 +5122,8 @@
         <w:t xml:space="preserve">No confirmation which zone is being used</w:t>
       </w:r>
     </w:p>
-    <w:bookmarkEnd w:id="64"/>
-    <w:bookmarkStart w:id="65" w:name="crew-comment-on-own-parachutes"/>
+    <w:bookmarkEnd w:id="65"/>
+    <w:bookmarkStart w:id="66" w:name="crew-comment-on-own-parachutes"/>
     <w:p>
       <w:pPr>
         <w:pStyle w:val="Heading3"/>
@@ -5058,9 +5190,9 @@
         <w:t xml:space="preserve">Should report visual on recovery assets</w:t>
       </w:r>
     </w:p>
-    <w:bookmarkEnd w:id="65"/>
     <w:bookmarkEnd w:id="66"/>
-    <w:bookmarkStart w:id="71" w:name="parachute-sequence-anomalies"/>
+    <w:bookmarkEnd w:id="67"/>
+    <w:bookmarkStart w:id="72" w:name="parachute-sequence-anomalies"/>
     <w:p>
       <w:pPr>
         <w:pStyle w:val="Heading2"/>
@@ -5069,7 +5201,7 @@
         <w:t xml:space="preserve">Parachute Sequence Anomalies</w:t>
       </w:r>
     </w:p>
-    <w:bookmarkStart w:id="67" w:name="pilot-chute-mystery"/>
+    <w:bookmarkStart w:id="68" w:name="pilot-chute-mystery"/>
     <w:p>
       <w:pPr>
         <w:pStyle w:val="Heading3"/>
@@ -5134,8 +5266,8 @@
         <w:t xml:space="preserve">Next callout still on drogues, then suddenly mains deploy</w:t>
       </w:r>
     </w:p>
-    <w:bookmarkEnd w:id="67"/>
-    <w:bookmarkStart w:id="68" w:name="drogue-separation-not-mentioned"/>
+    <w:bookmarkEnd w:id="68"/>
+    <w:bookmarkStart w:id="69" w:name="drogue-separation-not-mentioned"/>
     <w:p>
       <w:pPr>
         <w:pStyle w:val="Heading3"/>
@@ -5226,8 +5358,8 @@
         <w:t xml:space="preserve">Critical safety event</w:t>
       </w:r>
     </w:p>
-    <w:bookmarkEnd w:id="68"/>
-    <w:bookmarkStart w:id="69" w:name="reefing-mentioned-but-not-explained"/>
+    <w:bookmarkEnd w:id="69"/>
+    <w:bookmarkStart w:id="70" w:name="reefing-mentioned-but-not-explained"/>
     <w:p>
       <w:pPr>
         <w:pStyle w:val="Heading3"/>
@@ -5340,8 +5472,8 @@
         <w:t xml:space="preserve">”</w:t>
       </w:r>
     </w:p>
-    <w:bookmarkEnd w:id="69"/>
-    <w:bookmarkStart w:id="70" w:name="parachute-count-redundancy"/>
+    <w:bookmarkEnd w:id="70"/>
+    <w:bookmarkStart w:id="71" w:name="parachute-count-redundancy"/>
     <w:p>
       <w:pPr>
         <w:pStyle w:val="Heading3"/>
@@ -5450,9 +5582,9 @@
         <w:t xml:space="preserve">Why repeat three times in 14 seconds?</w:t>
       </w:r>
     </w:p>
-    <w:bookmarkEnd w:id="70"/>
     <w:bookmarkEnd w:id="71"/>
-    <w:bookmarkStart w:id="77" w:name="missing-critical-systems"/>
+    <w:bookmarkEnd w:id="72"/>
+    <w:bookmarkStart w:id="78" w:name="missing-critical-systems"/>
     <w:p>
       <w:pPr>
         <w:pStyle w:val="Heading2"/>
@@ -5461,7 +5593,7 @@
         <w:t xml:space="preserve">Missing Critical Systems</w:t>
       </w:r>
     </w:p>
-    <w:bookmarkStart w:id="72" w:name="no-reaction-control-system-rcs-mentions"/>
+    <w:bookmarkStart w:id="73" w:name="no-reaction-control-system-rcs-mentions"/>
     <w:p>
       <w:pPr>
         <w:pStyle w:val="Heading3"/>
@@ -5504,8 +5636,8 @@
         <w:t xml:space="preserve">of RCS activity</w:t>
       </w:r>
     </w:p>
-    <w:bookmarkEnd w:id="72"/>
-    <w:bookmarkStart w:id="73" w:name="no-power-system-status"/>
+    <w:bookmarkEnd w:id="73"/>
+    <w:bookmarkStart w:id="74" w:name="no-power-system-status"/>
     <w:p>
       <w:pPr>
         <w:pStyle w:val="Heading3"/>
@@ -5536,8 +5668,8 @@
         <w:t xml:space="preserve">mentioned</w:t>
       </w:r>
     </w:p>
-    <w:bookmarkEnd w:id="73"/>
-    <w:bookmarkStart w:id="74" w:name="Xd7bafef19850f7463c3203b1752e6dcba0eda3f"/>
+    <w:bookmarkEnd w:id="74"/>
+    <w:bookmarkStart w:id="75" w:name="Xd7bafef19850f7463c3203b1752e6dcba0eda3f"/>
     <w:p>
       <w:pPr>
         <w:pStyle w:val="Heading3"/>
@@ -5580,8 +5712,8 @@
         <w:t xml:space="preserve">of TPS sensors or ablation rates</w:t>
       </w:r>
     </w:p>
-    <w:bookmarkEnd w:id="74"/>
-    <w:bookmarkStart w:id="75" w:name="no-environmental-control-system-ecs"/>
+    <w:bookmarkEnd w:id="75"/>
+    <w:bookmarkStart w:id="76" w:name="no-environmental-control-system-ecs"/>
     <w:p>
       <w:pPr>
         <w:pStyle w:val="Heading3"/>
@@ -5614,8 +5746,8 @@
         <w:t xml:space="preserve">Only one vague mention at 1:37:30</w:t>
       </w:r>
     </w:p>
-    <w:bookmarkEnd w:id="75"/>
-    <w:bookmarkStart w:id="76" w:name="no-landing-bagimpact-attenuation"/>
+    <w:bookmarkEnd w:id="76"/>
+    <w:bookmarkStart w:id="77" w:name="no-landing-bagimpact-attenuation"/>
     <w:p>
       <w:pPr>
         <w:pStyle w:val="Heading3"/>
@@ -5646,9 +5778,9 @@
         <w:t xml:space="preserve">of impact attenuation system</w:t>
       </w:r>
     </w:p>
-    <w:bookmarkEnd w:id="76"/>
     <w:bookmarkEnd w:id="77"/>
-    <w:bookmarkStart w:id="84" w:name="post-splashdown-protocol-missing"/>
+    <w:bookmarkEnd w:id="78"/>
+    <w:bookmarkStart w:id="85" w:name="post-splashdown-protocol-missing"/>
     <w:p>
       <w:pPr>
         <w:pStyle w:val="Heading2"/>
@@ -5657,7 +5789,7 @@
         <w:t xml:space="preserve">Post-Splashdown Protocol Missing</w:t>
       </w:r>
     </w:p>
-    <w:bookmarkStart w:id="78" w:name="no-uprighting-system"/>
+    <w:bookmarkStart w:id="79" w:name="no-uprighting-system"/>
     <w:p>
       <w:pPr>
         <w:pStyle w:val="Heading3"/>
@@ -5700,8 +5832,8 @@
         <w:t xml:space="preserve">of capsule orientation or uprighting</w:t>
       </w:r>
     </w:p>
-    <w:bookmarkEnd w:id="78"/>
-    <w:bookmarkStart w:id="79" w:name="no-crew-egress-plan"/>
+    <w:bookmarkEnd w:id="79"/>
+    <w:bookmarkStart w:id="80" w:name="no-crew-egress-plan"/>
     <w:p>
       <w:pPr>
         <w:pStyle w:val="Heading3"/>
@@ -5738,8 +5870,8 @@
         <w:t xml:space="preserve">No discussion</w:t>
       </w:r>
     </w:p>
-    <w:bookmarkEnd w:id="79"/>
-    <w:bookmarkStart w:id="80" w:name="no-flotation-confirmation"/>
+    <w:bookmarkEnd w:id="80"/>
+    <w:bookmarkStart w:id="81" w:name="no-flotation-confirmation"/>
     <w:p>
       <w:pPr>
         <w:pStyle w:val="Heading3"/>
@@ -5818,8 +5950,8 @@
         <w:t xml:space="preserve">call</w:t>
       </w:r>
     </w:p>
-    <w:bookmarkEnd w:id="80"/>
-    <w:bookmarkStart w:id="81" w:name="no-recovery-swimmer-deploy"/>
+    <w:bookmarkEnd w:id="81"/>
+    <w:bookmarkStart w:id="82" w:name="no-recovery-swimmer-deploy"/>
     <w:p>
       <w:pPr>
         <w:pStyle w:val="Heading3"/>
@@ -5856,8 +5988,8 @@
         <w:t xml:space="preserve">No mention</w:t>
       </w:r>
     </w:p>
-    <w:bookmarkEnd w:id="81"/>
-    <w:bookmarkStart w:id="82" w:name="post-landing-command-unexplained"/>
+    <w:bookmarkEnd w:id="82"/>
+    <w:bookmarkStart w:id="83" w:name="post-landing-command-unexplained"/>
     <w:p>
       <w:pPr>
         <w:pStyle w:val="Heading3"/>
@@ -5916,8 +6048,8 @@
         <w:t xml:space="preserve">Never explained</w:t>
       </w:r>
     </w:p>
-    <w:bookmarkEnd w:id="82"/>
-    <w:bookmarkStart w:id="83" w:name="vldl-r---unknown-acronym"/>
+    <w:bookmarkEnd w:id="83"/>
+    <w:bookmarkStart w:id="84" w:name="vldl-r---unknown-acronym"/>
     <w:p>
       <w:pPr>
         <w:pStyle w:val="Heading3"/>
@@ -5988,9 +6120,9 @@
         <w:t xml:space="preserve">This acronym doesn’t exist in NASA documentation</w:t>
       </w:r>
     </w:p>
-    <w:bookmarkEnd w:id="83"/>
     <w:bookmarkEnd w:id="84"/>
-    <w:bookmarkStart w:id="87" w:name="timeline-precision-issues"/>
+    <w:bookmarkEnd w:id="85"/>
+    <w:bookmarkStart w:id="88" w:name="timeline-precision-issues"/>
     <w:p>
       <w:pPr>
         <w:pStyle w:val="Heading2"/>
@@ -5999,7 +6131,7 @@
         <w:t xml:space="preserve">Timeline Precision Issues</w:t>
       </w:r>
     </w:p>
-    <w:bookmarkStart w:id="85" w:name="timestamps-too-precise"/>
+    <w:bookmarkStart w:id="86" w:name="timestamps-too-precise"/>
     <w:p>
       <w:pPr>
         <w:pStyle w:val="Heading3"/>
@@ -6032,8 +6164,8 @@
         <w:t xml:space="preserve">This level of precision suggests post-production timestamp insertion</w:t>
       </w:r>
     </w:p>
-    <w:bookmarkEnd w:id="85"/>
-    <w:bookmarkStart w:id="86" w:name="uniform-commentary-gaps"/>
+    <w:bookmarkEnd w:id="86"/>
+    <w:bookmarkStart w:id="87" w:name="uniform-commentary-gaps"/>
     <w:p>
       <w:pPr>
         <w:pStyle w:val="Heading3"/>
@@ -6078,9 +6210,9 @@
         <w:t xml:space="preserve">Real blackout: minimal updates</w:t>
       </w:r>
     </w:p>
-    <w:bookmarkEnd w:id="86"/>
     <w:bookmarkEnd w:id="87"/>
-    <w:bookmarkStart w:id="91" w:name="spacecraft-behavior-anomalies"/>
+    <w:bookmarkEnd w:id="88"/>
+    <w:bookmarkStart w:id="92" w:name="spacecraft-behavior-anomalies"/>
     <w:p>
       <w:pPr>
         <w:pStyle w:val="Heading2"/>
@@ -6089,7 +6221,7 @@
         <w:t xml:space="preserve">Spacecraft Behavior Anomalies</w:t>
       </w:r>
     </w:p>
-    <w:bookmarkStart w:id="88" w:name="no-skip-entry-discussion"/>
+    <w:bookmarkStart w:id="89" w:name="no-skip-entry-discussion"/>
     <w:p>
       <w:pPr>
         <w:pStyle w:val="Heading3"/>
@@ -6150,8 +6282,8 @@
         <w:t xml:space="preserve">of which profile</w:t>
       </w:r>
     </w:p>
-    <w:bookmarkEnd w:id="88"/>
-    <w:bookmarkStart w:id="89" w:name="range-to-splashdown-callout"/>
+    <w:bookmarkEnd w:id="89"/>
+    <w:bookmarkStart w:id="90" w:name="range-to-splashdown-callout"/>
     <w:p>
       <w:pPr>
         <w:pStyle w:val="Heading3"/>
@@ -6216,8 +6348,8 @@
         <w:t xml:space="preserve">Unusual metric</w:t>
       </w:r>
     </w:p>
-    <w:bookmarkEnd w:id="89"/>
-    <w:bookmarkStart w:id="90" w:name="descent-rate-never-quantified"/>
+    <w:bookmarkEnd w:id="90"/>
+    <w:bookmarkStart w:id="91" w:name="descent-rate-never-quantified"/>
     <w:p>
       <w:pPr>
         <w:pStyle w:val="Heading3"/>
@@ -6276,9 +6408,9 @@
         <w:t xml:space="preserve">No number given</w:t>
       </w:r>
     </w:p>
-    <w:bookmarkEnd w:id="90"/>
     <w:bookmarkEnd w:id="91"/>
-    <w:bookmarkStart w:id="95" w:name="suspicious-languagephrasing"/>
+    <w:bookmarkEnd w:id="92"/>
+    <w:bookmarkStart w:id="96" w:name="suspicious-languagephrasing"/>
     <w:p>
       <w:pPr>
         <w:pStyle w:val="Heading2"/>
@@ -6287,7 +6419,7 @@
         <w:t xml:space="preserve">Suspicious Language/Phrasing</w:t>
       </w:r>
     </w:p>
-    <w:bookmarkStart w:id="92" w:name="hale-and-hearty---informal"/>
+    <w:bookmarkStart w:id="93" w:name="hale-and-hearty---informal"/>
     <w:p>
       <w:pPr>
         <w:pStyle w:val="Heading3"/>
@@ -6354,8 +6486,8 @@
         <w:t xml:space="preserve">PA commentary language, not flight controller</w:t>
       </w:r>
     </w:p>
-    <w:bookmarkEnd w:id="92"/>
-    <w:bookmarkStart w:id="93" w:name="X2e16ebe8cae30d74ee3b477ae96089e279901e3"/>
+    <w:bookmarkEnd w:id="93"/>
+    <w:bookmarkStart w:id="94" w:name="X2e16ebe8cae30d74ee3b477ae96089e279901e3"/>
     <w:p>
       <w:pPr>
         <w:pStyle w:val="Heading3"/>
@@ -6394,8 +6526,8 @@
         <w:t xml:space="preserve">Passive voice, no confirmation of execution</w:t>
       </w:r>
     </w:p>
-    <w:bookmarkEnd w:id="93"/>
-    <w:bookmarkStart w:id="94" w:name="numbers-too-round"/>
+    <w:bookmarkEnd w:id="94"/>
+    <w:bookmarkStart w:id="95" w:name="numbers-too-round"/>
     <w:p>
       <w:pPr>
         <w:pStyle w:val="Heading3"/>
@@ -6440,9 +6572,9 @@
         <w:t xml:space="preserve">Real telemetry typically more precise</w:t>
       </w:r>
     </w:p>
-    <w:bookmarkEnd w:id="94"/>
     <w:bookmarkEnd w:id="95"/>
-    <w:bookmarkStart w:id="99" w:name="crew-communication-anomalies"/>
+    <w:bookmarkEnd w:id="96"/>
+    <w:bookmarkStart w:id="100" w:name="crew-communication-anomalies"/>
     <w:p>
       <w:pPr>
         <w:pStyle w:val="Heading2"/>
@@ -6451,7 +6583,7 @@
         <w:t xml:space="preserve">Crew Communication Anomalies</w:t>
       </w:r>
     </w:p>
-    <w:bookmarkStart w:id="96" w:name="crew-sounds-too-calm"/>
+    <w:bookmarkStart w:id="97" w:name="crew-sounds-too-calm"/>
     <w:p>
       <w:pPr>
         <w:pStyle w:val="Heading3"/>
@@ -6484,8 +6616,8 @@
         <w:t xml:space="preserve">Even radio quality perfect</w:t>
       </w:r>
     </w:p>
-    <w:bookmarkEnd w:id="96"/>
-    <w:bookmarkStart w:id="97" w:name="minimal-crew-input"/>
+    <w:bookmarkEnd w:id="97"/>
+    <w:bookmarkStart w:id="98" w:name="minimal-crew-input"/>
     <w:p>
       <w:pPr>
         <w:pStyle w:val="Heading3"/>
@@ -6518,8 +6650,8 @@
         <w:t xml:space="preserve">Most missions: crew actively participates</w:t>
       </w:r>
     </w:p>
-    <w:bookmarkEnd w:id="97"/>
-    <w:bookmarkStart w:id="98" w:name="no-pre-landing-checklist-readback"/>
+    <w:bookmarkEnd w:id="98"/>
+    <w:bookmarkStart w:id="99" w:name="no-pre-landing-checklist-readback"/>
     <w:p>
       <w:pPr>
         <w:pStyle w:val="Heading3"/>
@@ -6564,9 +6696,9 @@
         <w:t xml:space="preserve">”</w:t>
       </w:r>
     </w:p>
-    <w:bookmarkEnd w:id="98"/>
     <w:bookmarkEnd w:id="99"/>
-    <w:bookmarkStart w:id="100" w:name="summary-second-pass"/>
+    <w:bookmarkEnd w:id="100"/>
+    <w:bookmarkStart w:id="101" w:name="summary-second-pass"/>
     <w:p>
       <w:pPr>
         <w:pStyle w:val="Heading2"/>
@@ -6604,9 +6736,9 @@
         </w:pict>
       </w:r>
     </w:p>
-    <w:bookmarkEnd w:id="100"/>
     <w:bookmarkEnd w:id="101"/>
-    <w:bookmarkStart w:id="111" w:name="comprehensive-analysis---third-pass"/>
+    <w:bookmarkEnd w:id="102"/>
+    <w:bookmarkStart w:id="112" w:name="comprehensive-analysis---third-pass"/>
     <w:p>
       <w:pPr>
         <w:pStyle w:val="Heading1"/>
@@ -6633,7 +6765,7 @@
         <w:t xml:space="preserve">Final deep examination focusing strictly on what can be proven from the transcript itself, separating internal contradictions from external-dependent observations.</w:t>
       </w:r>
     </w:p>
-    <w:bookmarkStart w:id="108" w:name="Xd91ee5b60d87c146c60434bf35b98aef0a8632a"/>
+    <w:bookmarkStart w:id="109" w:name="Xd91ee5b60d87c146c60434bf35b98aef0a8632a"/>
     <w:p>
       <w:pPr>
         <w:pStyle w:val="Heading2"/>
@@ -6642,7 +6774,7 @@
         <w:t xml:space="preserve">Internal Contradictions (Provable From Script)</w:t>
       </w:r>
     </w:p>
-    <w:bookmarkStart w:id="102" w:name="minutes-left-repeated-unchanged"/>
+    <w:bookmarkStart w:id="103" w:name="minutes-left-repeated-unchanged"/>
     <w:p>
       <w:pPr>
         <w:pStyle w:val="Heading3"/>
@@ -6741,8 +6873,8 @@
         <w:t xml:space="preserve">9 seconds elapsed, time count unchanged</w:t>
       </w:r>
     </w:p>
-    <w:bookmarkEnd w:id="102"/>
-    <w:bookmarkStart w:id="103" w:name="blackout-remaining-callouts-disagree"/>
+    <w:bookmarkEnd w:id="103"/>
+    <w:bookmarkStart w:id="104" w:name="blackout-remaining-callouts-disagree"/>
     <w:p>
       <w:pPr>
         <w:pStyle w:val="Heading3"/>
@@ -6917,8 +7049,8 @@
         <w:t xml:space="preserve">Internal predictions disagree with each other and the six-minute claim</w:t>
       </w:r>
     </w:p>
-    <w:bookmarkEnd w:id="103"/>
-    <w:bookmarkStart w:id="104" w:name="altitude-vs.-time-descent-rate-changes"/>
+    <w:bookmarkEnd w:id="104"/>
+    <w:bookmarkStart w:id="105" w:name="altitude-vs.-time-descent-rate-changes"/>
     <w:p>
       <w:pPr>
         <w:pStyle w:val="Heading3"/>
@@ -6977,8 +7109,8 @@
         <w:t xml:space="preserve">- Descent rate implied by script keeps changing dramatically</w:t>
       </w:r>
     </w:p>
-    <w:bookmarkEnd w:id="104"/>
-    <w:bookmarkStart w:id="105" w:name="drogue-descent-speed-internal"/>
+    <w:bookmarkEnd w:id="105"/>
+    <w:bookmarkStart w:id="106" w:name="drogue-descent-speed-internal"/>
     <w:p>
       <w:pPr>
         <w:pStyle w:val="Heading3"/>
@@ -7021,8 +7153,8 @@
         <w:t xml:space="preserve">Descent rate calculation depends on deployment altitude (not stated)</w:t>
       </w:r>
     </w:p>
-    <w:bookmarkEnd w:id="105"/>
-    <w:bookmarkStart w:id="106" w:name="Xacd6cfd8637b86959f1a4f793cd939e904de51d"/>
+    <w:bookmarkEnd w:id="106"/>
+    <w:bookmarkStart w:id="107" w:name="Xacd6cfd8637b86959f1a4f793cd939e904de51d"/>
     <w:p>
       <w:pPr>
         <w:pStyle w:val="Heading3"/>
@@ -7093,8 +7225,8 @@
         <w:t xml:space="preserve">Confirmation cover actually jettisoned</w:t>
       </w:r>
     </w:p>
-    <w:bookmarkEnd w:id="106"/>
-    <w:bookmarkStart w:id="107" w:name="wordingtranscription-garbles"/>
+    <w:bookmarkEnd w:id="107"/>
+    <w:bookmarkStart w:id="108" w:name="wordingtranscription-garbles"/>
     <w:p>
       <w:pPr>
         <w:pStyle w:val="Heading3"/>
@@ -7260,9 +7392,9 @@
         <w:t xml:space="preserve">— repeated/garbled word</w:t>
       </w:r>
     </w:p>
-    <w:bookmarkEnd w:id="107"/>
     <w:bookmarkEnd w:id="108"/>
-    <w:bookmarkStart w:id="110" w:name="summary-third-pass"/>
+    <w:bookmarkEnd w:id="109"/>
+    <w:bookmarkStart w:id="111" w:name="summary-third-pass"/>
     <w:p>
       <w:pPr>
         <w:pStyle w:val="Heading2"/>
@@ -7293,7 +7425,7 @@
         <w:t xml:space="preserve">Total issues across all three passes: 64 items</w:t>
       </w:r>
     </w:p>
-    <w:bookmarkStart w:id="109" w:name="issue-distribution-by-severity"/>
+    <w:bookmarkStart w:id="110" w:name="issue-distribution-by-severity"/>
     <w:p>
       <w:pPr>
         <w:pStyle w:val="Heading3"/>
@@ -7397,10 +7529,10 @@
         </w:pict>
       </w:r>
     </w:p>
-    <w:bookmarkEnd w:id="109"/>
     <w:bookmarkEnd w:id="110"/>
     <w:bookmarkEnd w:id="111"/>
-    <w:bookmarkStart w:id="128" w:name="final-report---tier-based-findings"/>
+    <w:bookmarkEnd w:id="112"/>
+    <w:bookmarkStart w:id="129" w:name="final-report---tier-based-findings"/>
     <w:p>
       <w:pPr>
         <w:pStyle w:val="Heading1"/>
@@ -7427,7 +7559,7 @@
         <w:t xml:space="preserve">Separate findings by verification method to maintain objectivity and eliminate bias.</w:t>
       </w:r>
     </w:p>
-    <w:bookmarkStart w:id="112" w:name="understanding-the-tier-system"/>
+    <w:bookmarkStart w:id="113" w:name="understanding-the-tier-system"/>
     <w:p>
       <w:pPr>
         <w:pStyle w:val="Heading2"/>
@@ -7514,8 +7646,8 @@
         </w:pict>
       </w:r>
     </w:p>
-    <w:bookmarkEnd w:id="112"/>
-    <w:bookmarkStart w:id="124" w:name="tier-1-provable-from-the-script-alone"/>
+    <w:bookmarkEnd w:id="113"/>
+    <w:bookmarkStart w:id="125" w:name="tier-1-provable-from-the-script-alone"/>
     <w:p>
       <w:pPr>
         <w:pStyle w:val="Heading2"/>
@@ -7532,7 +7664,7 @@
         <w:t xml:space="preserve">These are internal contradictions and inconsistencies anyone can confirm just by reading the transcript.</w:t>
       </w:r>
     </w:p>
-    <w:bookmarkStart w:id="113" w:name="Xd7a71e79b2fe37b838c56cef1b72f493e4671f1"/>
+    <w:bookmarkStart w:id="114" w:name="Xd7a71e79b2fe37b838c56cef1b72f493e4671f1"/>
     <w:p>
       <w:pPr>
         <w:pStyle w:val="Heading3"/>
@@ -7686,8 +7818,8 @@
         <w:t xml:space="preserve">”</w:t>
       </w:r>
     </w:p>
-    <w:bookmarkEnd w:id="113"/>
-    <w:bookmarkStart w:id="114" w:name="X309d415eb490c981ddd4c846479124d4fc7aff1"/>
+    <w:bookmarkEnd w:id="114"/>
+    <w:bookmarkStart w:id="115" w:name="X309d415eb490c981ddd4c846479124d4fc7aff1"/>
     <w:p>
       <w:pPr>
         <w:pStyle w:val="Heading3"/>
@@ -8117,8 +8249,8 @@
         <w:t xml:space="preserve">than the transcript’s own splashdown time</w:t>
       </w:r>
     </w:p>
-    <w:bookmarkEnd w:id="114"/>
-    <w:bookmarkStart w:id="115" w:name="X14fa89b6ce18c58d9eb3ec01975143eec3b2761"/>
+    <w:bookmarkEnd w:id="115"/>
+    <w:bookmarkStart w:id="116" w:name="X14fa89b6ce18c58d9eb3ec01975143eec3b2761"/>
     <w:p>
       <w:pPr>
         <w:pStyle w:val="Heading3"/>
@@ -8225,8 +8357,8 @@
         <w:t xml:space="preserve">Nine seconds pass, but the remaining time does not change.</w:t>
       </w:r>
     </w:p>
-    <w:bookmarkEnd w:id="115"/>
-    <w:bookmarkStart w:id="116" w:name="X9cb972ee7b1fba9dc1038bf28acf71090e6f398"/>
+    <w:bookmarkEnd w:id="116"/>
+    <w:bookmarkStart w:id="117" w:name="X9cb972ee7b1fba9dc1038bf28acf71090e6f398"/>
     <w:p>
       <w:pPr>
         <w:pStyle w:val="Heading3"/>
@@ -8436,8 +8568,8 @@
         <w:t xml:space="preserve">— later than every estimate</w:t>
       </w:r>
     </w:p>
-    <w:bookmarkEnd w:id="116"/>
-    <w:bookmarkStart w:id="117" w:name="Xbd20b044e6ea8935281253e5bcd94f925fde8ce"/>
+    <w:bookmarkEnd w:id="117"/>
+    <w:bookmarkStart w:id="118" w:name="Xbd20b044e6ea8935281253e5bcd94f925fde8ce"/>
     <w:p>
       <w:pPr>
         <w:pStyle w:val="Heading3"/>
@@ -8674,8 +8806,8 @@
         <w:t xml:space="preserve">Reporting builds to full multi-asset visual, then downgrades to intermittent</w:t>
       </w:r>
     </w:p>
-    <w:bookmarkEnd w:id="117"/>
-    <w:bookmarkStart w:id="118" w:name="Xf94900b3fa18e5497ffffee1ca9cbe8f4ce6790"/>
+    <w:bookmarkEnd w:id="118"/>
+    <w:bookmarkStart w:id="119" w:name="Xf94900b3fa18e5497ffffee1ca9cbe8f4ce6790"/>
     <w:p>
       <w:pPr>
         <w:pStyle w:val="Heading3"/>
@@ -8730,8 +8862,8 @@
         <w:t xml:space="preserve">As written, cabin pressure is tied to hydrazine (propellant) checks — the script does not explain this logic</w:t>
       </w:r>
     </w:p>
-    <w:bookmarkEnd w:id="118"/>
-    <w:bookmarkStart w:id="119" w:name="X8e185dc91197071aa86bf9c66de6eb0bbf3c7a2"/>
+    <w:bookmarkEnd w:id="119"/>
+    <w:bookmarkStart w:id="120" w:name="X8e185dc91197071aa86bf9c66de6eb0bbf3c7a2"/>
     <w:p>
       <w:pPr>
         <w:pStyle w:val="Heading3"/>
@@ -8820,8 +8952,8 @@
         <w:t xml:space="preserve">The failure is raised, restated, never addressed again</w:t>
       </w:r>
     </w:p>
-    <w:bookmarkEnd w:id="119"/>
-    <w:bookmarkStart w:id="120" w:name="X10bf6c9bbb1b90890e71ce279bdb03c633a1b0b"/>
+    <w:bookmarkEnd w:id="120"/>
+    <w:bookmarkStart w:id="121" w:name="X10bf6c9bbb1b90890e71ce279bdb03c633a1b0b"/>
     <w:p>
       <w:pPr>
         <w:pStyle w:val="Heading3"/>
@@ -8906,8 +9038,8 @@
         <w:t xml:space="preserve">The transcript never states the cover actually jettisoned</w:t>
       </w:r>
     </w:p>
-    <w:bookmarkEnd w:id="120"/>
-    <w:bookmarkStart w:id="121" w:name="undefined-term-vldl-r"/>
+    <w:bookmarkEnd w:id="121"/>
+    <w:bookmarkStart w:id="122" w:name="undefined-term-vldl-r"/>
     <w:p>
       <w:pPr>
         <w:pStyle w:val="Heading3"/>
@@ -8974,8 +9106,8 @@
         <w:t xml:space="preserve">The term appears once, is never defined, used nowhere else</w:t>
       </w:r>
     </w:p>
-    <w:bookmarkEnd w:id="121"/>
-    <w:bookmarkStart w:id="122" w:name="repeated-redundant-confirmations"/>
+    <w:bookmarkEnd w:id="122"/>
+    <w:bookmarkStart w:id="123" w:name="repeated-redundant-confirmations"/>
     <w:p>
       <w:pPr>
         <w:pStyle w:val="Heading3"/>
@@ -9050,8 +9182,8 @@
         <w:t xml:space="preserve">1:39:34, 1:39:39, 1:39:41</w:t>
       </w:r>
     </w:p>
-    <w:bookmarkEnd w:id="122"/>
-    <w:bookmarkStart w:id="123" w:name="X3dae795ceaa47cc7c4c842258f6f2440408ca96"/>
+    <w:bookmarkEnd w:id="123"/>
+    <w:bookmarkStart w:id="124" w:name="X3dae795ceaa47cc7c4c842258f6f2440408ca96"/>
     <w:p>
       <w:pPr>
         <w:pStyle w:val="Heading3"/>
@@ -9125,9 +9257,9 @@
         </w:pict>
       </w:r>
     </w:p>
-    <w:bookmarkEnd w:id="123"/>
     <w:bookmarkEnd w:id="124"/>
-    <w:bookmarkStart w:id="125" w:name="Xf1e3145558284821e5f99f0b1725629bcde17d0"/>
+    <w:bookmarkEnd w:id="125"/>
+    <w:bookmarkStart w:id="126" w:name="Xf1e3145558284821e5f99f0b1725629bcde17d0"/>
     <w:p>
       <w:pPr>
         <w:pStyle w:val="Heading2"/>
@@ -9388,8 +9520,8 @@
         </w:pict>
       </w:r>
     </w:p>
-    <w:bookmarkEnd w:id="125"/>
-    <w:bookmarkStart w:id="126" w:name="Xdc9ceabf4df6bf2cc20df2b46b404ca36cf5bd6"/>
+    <w:bookmarkEnd w:id="126"/>
+    <w:bookmarkStart w:id="127" w:name="Xdc9ceabf4df6bf2cc20df2b46b404ca36cf5bd6"/>
     <w:p>
       <w:pPr>
         <w:pStyle w:val="Heading2"/>
@@ -9603,8 +9735,8 @@
         </w:pict>
       </w:r>
     </w:p>
-    <w:bookmarkEnd w:id="126"/>
-    <w:bookmarkStart w:id="127" w:name="summary-table-provable-findings-only"/>
+    <w:bookmarkEnd w:id="127"/>
+    <w:bookmarkStart w:id="128" w:name="summary-table-provable-findings-only"/>
     <w:p>
       <w:pPr>
         <w:pStyle w:val="Heading2"/>
@@ -10334,9 +10466,9 @@
         </w:pict>
       </w:r>
     </w:p>
-    <w:bookmarkEnd w:id="127"/>
     <w:bookmarkEnd w:id="128"/>
-    <w:bookmarkStart w:id="133" w:name="conclusion"/>
+    <w:bookmarkEnd w:id="129"/>
+    <w:bookmarkStart w:id="134" w:name="conclusion"/>
     <w:p>
       <w:pPr>
         <w:pStyle w:val="Heading1"/>
@@ -10345,7 +10477,7 @@
         <w:t xml:space="preserve">Conclusion</w:t>
       </w:r>
     </w:p>
-    <w:bookmarkStart w:id="129" w:name="what-can-be-proven"/>
+    <w:bookmarkStart w:id="130" w:name="what-can-be-proven"/>
     <w:p>
       <w:pPr>
         <w:pStyle w:val="Heading2"/>
@@ -10534,8 +10666,8 @@
         <w:t xml:space="preserve">These issues are verifiable by anyone reading the transcript with no outside knowledge required.</w:t>
       </w:r>
     </w:p>
-    <w:bookmarkEnd w:id="129"/>
-    <w:bookmarkStart w:id="130" w:name="X9a46631170fc91d5826bbb10e331bbf4a2ee01d"/>
+    <w:bookmarkEnd w:id="130"/>
+    <w:bookmarkStart w:id="131" w:name="X9a46631170fc91d5826bbb10e331bbf4a2ee01d"/>
     <w:p>
       <w:pPr>
         <w:pStyle w:val="Heading2"/>
@@ -10588,8 +10720,8 @@
         <w:t xml:space="preserve">Presenting them as established faults would introduce bias.</w:t>
       </w:r>
     </w:p>
-    <w:bookmarkEnd w:id="130"/>
-    <w:bookmarkStart w:id="131" w:name="possible-explanations"/>
+    <w:bookmarkEnd w:id="131"/>
+    <w:bookmarkStart w:id="132" w:name="possible-explanations"/>
     <w:p>
       <w:pPr>
         <w:pStyle w:val="Heading2"/>
@@ -10753,8 +10885,8 @@
         </w:pict>
       </w:r>
     </w:p>
-    <w:bookmarkEnd w:id="131"/>
-    <w:bookmarkStart w:id="132" w:name="research-compiled-by"/>
+    <w:bookmarkEnd w:id="132"/>
+    <w:bookmarkStart w:id="133" w:name="research-compiled-by"/>
     <w:p>
       <w:pPr>
         <w:pStyle w:val="Heading2"/>
@@ -10873,8 +11005,8 @@
         <w:t xml:space="preserve">This analysis examines the transcript for internal consistency and documents all findings transparently. Claims are separated by verification method to maintain objectivity. The strongest findings are those provable from the script’s own text without requiring external assumptions.</w:t>
       </w:r>
     </w:p>
-    <w:bookmarkEnd w:id="132"/>
     <w:bookmarkEnd w:id="133"/>
+    <w:bookmarkEnd w:id="134"/>
     <w:sectPr/>
   </w:body>
 </w:document>

</xml_diff>